<commit_message>
style: ultra-minimal Word document with only short text and portfolio link
</commit_message>
<xml_diff>
--- a/Ruslana_Buinytska_CV.docx
+++ b/Ruslana_Buinytska_CV.docx
@@ -4,23 +4,21 @@
   <w:body>
     <w:p>
       <w:pPr>
-        <w:spacing w:before="0" w:after="40"/>
-        <w:jc w:val="center"/>
+        <w:spacing w:before="0" w:after="80"/>
       </w:pPr>
       <w:r>
         <w:rPr>
           <w:rFonts w:ascii="Calibri" w:hAnsi="Calibri"/>
           <w:b/>
           <w:color w:val="1E3A8A"/>
-          <w:sz w:val="48"/>
+          <w:sz w:val="52"/>
         </w:rPr>
         <w:t>Ing. Ruslana Buinytska</w:t>
       </w:r>
     </w:p>
     <w:p>
       <w:pPr>
-        <w:spacing w:before="0" w:after="160"/>
-        <w:jc w:val="center"/>
+        <w:spacing w:before="0" w:after="240"/>
       </w:pPr>
       <w:r>
         <w:rPr>
@@ -34,338 +32,80 @@
     </w:p>
     <w:p>
       <w:pPr>
-        <w:spacing w:before="0" w:after="320"/>
-        <w:jc w:val="center"/>
+        <w:spacing w:before="0" w:after="400"/>
+        <w:pBdr>
+          <w:bottom w:val="single" w:sz="8" w:space="1" w:color="1E3A8A"/>
+        </w:pBdr>
+      </w:pPr>
+    </w:p>
+    <w:p>
+      <w:pPr>
+        <w:spacing w:before="0" w:after="480" w:line="300" w:lineRule="auto"/>
       </w:pPr>
       <w:r>
         <w:rPr>
-          <w:color w:val="475569"/>
-          <w:sz w:val="19"/>
-        </w:rPr>
-        <w:t xml:space="preserve">Bratislava, Slovensko  •  Tel: +421 951 698 832  •  Email: </w:t>
-      </w:r>
-      <w:hyperlink r:id="rId9">
-        <w:r>
-          <w:rPr>
-            <w:color w:val="1E3A8A"/>
-            <w:u w:val="single"/>
-          </w:rPr>
-          <w:t>rusbuin.oct@gmail.com</w:t>
-        </w:r>
-      </w:hyperlink>
-      <w:r>
-        <w:rPr>
-          <w:color w:val="475569"/>
-          <w:sz w:val="19"/>
-        </w:rPr>
-        <w:br/>
-        <w:t xml:space="preserve">LinkedIn: </w:t>
-      </w:r>
-      <w:hyperlink r:id="rId10">
-        <w:r>
-          <w:rPr>
-            <w:color w:val="1E3A8A"/>
-            <w:u w:val="single"/>
-          </w:rPr>
-          <w:t>linkedin.com/in/ruslana-buinytska</w:t>
-        </w:r>
-      </w:hyperlink>
-      <w:r>
-        <w:rPr>
-          <w:color w:val="475569"/>
-          <w:sz w:val="19"/>
-        </w:rPr>
-        <w:t xml:space="preserve">  •  GitHub: </w:t>
-      </w:r>
-      <w:hyperlink r:id="rId11">
-        <w:r>
-          <w:rPr>
-            <w:color w:val="1E3A8A"/>
-            <w:u w:val="single"/>
-          </w:rPr>
-          <w:t>github.com/rbuinytska</w:t>
-        </w:r>
-      </w:hyperlink>
-    </w:p>
-    <w:tbl>
-      <w:tblPr>
-        <w:tblW w:type="auto" w:w="0"/>
-        <w:jc w:val="center"/>
-        <w:tblLook w:firstColumn="1" w:firstRow="1" w:lastColumn="0" w:lastRow="0" w:noHBand="0" w:noVBand="1" w:val="04A0"/>
-      </w:tblPr>
-      <w:tblGrid>
-        <w:gridCol w:w="9461"/>
-      </w:tblGrid>
-      <w:tr>
-        <w:tc>
-          <w:tcPr>
-            <w:tcW w:type="dxa" w:w="9360"/>
-            <w:shd w:val="clear" w:color="auto" w:fill="F1F5F9"/>
-            <w:tcBorders>
-              <w:top w:val="single" w:sz="12" w:space="0" w:color="1E3A8A"/>
-              <w:left w:val="single" w:sz="12" w:space="0" w:color="1E3A8A"/>
-              <w:bottom w:val="single" w:sz="12" w:space="0" w:color="1E3A8A"/>
-              <w:right w:val="single" w:sz="12" w:space="0" w:color="1E3A8A"/>
-            </w:tcBorders>
-          </w:tcPr>
-          <w:p>
-            <w:pPr>
-              <w:spacing w:before="160" w:after="80"/>
-              <w:jc w:val="center"/>
-            </w:pPr>
-            <w:r>
-              <w:rPr>
-                <w:b/>
-                <w:color w:val="1E3A8A"/>
-                <w:sz w:val="22"/>
-              </w:rPr>
-              <w:t>INTERAKTÍVNE PORTFÓLIO &amp; KOMPLETNÝ ŽIVOTOPIS</w:t>
-            </w:r>
-          </w:p>
-          <w:p>
-            <w:pPr>
-              <w:spacing w:before="0" w:after="80"/>
-              <w:jc w:val="center"/>
-            </w:pPr>
-            <w:hyperlink r:id="rId12">
-              <w:r>
-                <w:rPr>
-                  <w:color w:val="2563EB"/>
-                  <w:u w:val="single"/>
-                  <w:b/>
-                  <w:sz w:val="28"/>
-                </w:rPr>
-                <w:t>https://rbuinytska.github.io</w:t>
-              </w:r>
-            </w:hyperlink>
-          </w:p>
-          <w:p>
-            <w:pPr>
-              <w:spacing w:before="0" w:after="160"/>
-              <w:jc w:val="center"/>
-            </w:pPr>
-            <w:r>
-              <w:rPr>
-                <w:i/>
-                <w:color w:val="475569"/>
-                <w:sz w:val="19"/>
-              </w:rPr>
-              <w:t>Kliknite na odkaz vyššie pre zobrazenie interaktívnych projektov, systémových špecifikácií a certifikácií.</w:t>
-            </w:r>
-          </w:p>
-        </w:tc>
-      </w:tr>
-    </w:tbl>
-    <w:p>
-      <w:pPr>
-        <w:spacing w:before="360" w:after="80"/>
-        <w:pBdr>
-          <w:bottom w:val="single" w:sz="6" w:space="2" w:color="1E3A8A"/>
-        </w:pBdr>
-      </w:pPr>
-      <w:r>
-        <w:rPr>
-          <w:b/>
-          <w:color w:val="1E3A8A"/>
+          <w:rFonts w:ascii="Calibri" w:hAnsi="Calibri"/>
+          <w:color w:val="0F172A"/>
           <w:sz w:val="22"/>
         </w:rPr>
-        <w:t>STRUČNÝ PROFIL</w:t>
+        <w:t>Som inžinierka Informačného manažmentu (EUBA, certifikácia IPMA) so zameraním na IT systémovú analýzu, riadenie IT projektov a dáta. Prepájam biznisové požiadavky s technickou realitou. Vďaka praktickej skúsenosti zo softvérového vývoja rozumiem architektúre systémov do hĺbky, čo mi umožňuje tvoriť precízne funkčné a technické špecifikácie bez logických medzier, viesť agilné tímy a byť rovnocenným partnerom pre vývojárov aj manažment.</w:t>
       </w:r>
     </w:p>
     <w:p>
       <w:pPr>
-        <w:spacing w:before="80" w:after="240" w:line="276" w:lineRule="auto"/>
+        <w:spacing w:before="0" w:after="160"/>
       </w:pPr>
       <w:r>
         <w:rPr>
-          <w:color w:val="0F172A"/>
-          <w:sz w:val="20"/>
+          <w:rFonts w:ascii="Calibri" w:hAnsi="Calibri"/>
+          <w:color w:val="475569"/>
+          <w:sz w:val="22"/>
         </w:rPr>
-        <w:t>Som inžinierka Informačného manažmentu (EUBA) so zameraním na IT analýzu, riadenie IT projektov a dátovú architektúru. Vďaka praktickej skúsenosti zo softvérového vývoja rozumiem architektúre systémov do hĺbky, čo mi umožňuje tvoriť precízne funkčné a technické špecifikácie bez logických medzier, navrhovať REST API a JSON schémy, viesť agilné tímy (certifikácia IPMA, SCRUM) a byť rovnocenným partnerom pre vývojárov aj manažment.</w:t>
+        <w:t>Kompletný interaktívny životopis, projekty a špecifikácie nájdete na:</w:t>
       </w:r>
     </w:p>
     <w:p>
       <w:pPr>
-        <w:spacing w:before="200" w:after="80"/>
+        <w:spacing w:before="0" w:after="600"/>
+      </w:pPr>
+      <w:hyperlink r:id="rId9">
+        <w:r>
+          <w:rPr>
+            <w:color w:val="2563EB"/>
+            <w:u w:val="single"/>
+            <w:b/>
+            <w:sz w:val="32"/>
+          </w:rPr>
+          <w:t>https://rbuinytska.github.io</w:t>
+        </w:r>
+      </w:hyperlink>
+    </w:p>
+    <w:p>
+      <w:pPr>
+        <w:spacing w:before="0" w:after="280"/>
         <w:pBdr>
-          <w:bottom w:val="single" w:sz="6" w:space="2" w:color="1E3A8A"/>
+          <w:bottom w:val="single" w:sz="6" w:space="1" w:color="CBD5E1"/>
         </w:pBdr>
+      </w:pPr>
+    </w:p>
+    <w:p>
+      <w:pPr>
+        <w:spacing w:before="0" w:after="80" w:line="288" w:lineRule="auto"/>
       </w:pPr>
       <w:r>
         <w:rPr>
-          <w:b/>
-          <w:color w:val="1E3A8A"/>
-          <w:sz w:val="22"/>
-        </w:rPr>
-        <w:t>KĽÚČOVÉ OBLASTI PÔSOBENIA</w:t>
-      </w:r>
-    </w:p>
-    <w:p>
-      <w:pPr>
-        <w:pStyle w:val="ListBullet"/>
-        <w:spacing w:before="40" w:after="40"/>
-      </w:pPr>
-      <w:r>
-        <w:rPr>
-          <w:b/>
-          <w:color w:val="1E3A8A"/>
-          <w:sz w:val="19"/>
-        </w:rPr>
-        <w:t xml:space="preserve">IT Systémová &amp; Biznis Analýza: </w:t>
-      </w:r>
-      <w:r>
-        <w:rPr>
-          <w:color w:val="0F172A"/>
-          <w:sz w:val="19"/>
-        </w:rPr>
-        <w:t>Modelovanie v UML a BPMN (Enterprise Architect), dekompozícia požiadaviek stakeholderov, funkčné špecifikácie, návrh API kontraktov (REST, JSON) a akceptačné testovanie.</w:t>
-      </w:r>
-    </w:p>
-    <w:p>
-      <w:pPr>
-        <w:pStyle w:val="ListBullet"/>
-        <w:spacing w:before="40" w:after="40"/>
-      </w:pPr>
-      <w:r>
-        <w:rPr>
-          <w:b/>
-          <w:color w:val="1E3A8A"/>
-          <w:sz w:val="19"/>
-        </w:rPr>
-        <w:t xml:space="preserve">IT Projektový Manažment: </w:t>
-      </w:r>
-      <w:r>
-        <w:rPr>
-          <w:color w:val="0F172A"/>
-          <w:sz w:val="19"/>
-        </w:rPr>
-        <w:t>Medzinárodná certifikácia IPMA Project Management Fundamentals (2025), agilné rámce SCRUM &amp; Kanban, prioritizácia sprintov, riadenie rizík a koordinácia dodávky.</w:t>
-      </w:r>
-    </w:p>
-    <w:p>
-      <w:pPr>
-        <w:pStyle w:val="ListBullet"/>
-        <w:spacing w:before="40" w:after="40"/>
-      </w:pPr>
-      <w:r>
-        <w:rPr>
-          <w:b/>
-          <w:color w:val="1E3A8A"/>
-          <w:sz w:val="19"/>
-        </w:rPr>
-        <w:t xml:space="preserve">Dáta, SQL &amp; Power BI: </w:t>
-      </w:r>
-      <w:r>
-        <w:rPr>
-          <w:color w:val="0F172A"/>
-          <w:sz w:val="19"/>
-        </w:rPr>
-        <w:t>Relačné databázy, Oracle SQL, dátové modelovanie (Star Schema), ETL toky dát, interaktívne manažérske dashboardy v Power BI (DAX) a Tableau.</w:t>
-      </w:r>
-    </w:p>
-    <w:p>
-      <w:pPr>
-        <w:pStyle w:val="ListBullet"/>
-        <w:spacing w:before="40" w:after="40"/>
-      </w:pPr>
-      <w:r>
-        <w:rPr>
-          <w:b/>
-          <w:color w:val="1E3A8A"/>
-          <w:sz w:val="19"/>
-        </w:rPr>
-        <w:t xml:space="preserve">Technický Vývoj &amp; AI: </w:t>
-      </w:r>
-      <w:r>
-        <w:rPr>
-          <w:color w:val="0F172A"/>
-          <w:sz w:val="19"/>
-        </w:rPr>
-        <w:t>Prax z vývoja (Kotlin/KMP, Java, Git), návrh aplikačnej logiky, integrácia LLM modelov a AI agentov.</w:t>
-      </w:r>
-    </w:p>
-    <w:p>
-      <w:pPr>
-        <w:spacing w:before="240" w:after="80"/>
-        <w:pBdr>
-          <w:bottom w:val="single" w:sz="6" w:space="2" w:color="1E3A8A"/>
-        </w:pBdr>
-      </w:pPr>
-      <w:r>
-        <w:rPr>
-          <w:b/>
-          <w:color w:val="1E3A8A"/>
-          <w:sz w:val="22"/>
-        </w:rPr>
-        <w:t>VZDELANIE &amp; CERTIFIKÁCIA</w:t>
-      </w:r>
-    </w:p>
-    <w:p>
-      <w:pPr>
-        <w:pStyle w:val="ListBullet"/>
-        <w:spacing w:before="20" w:after="40"/>
-      </w:pPr>
-      <w:r>
-        <w:rPr>
-          <w:b/>
-          <w:color w:val="0F172A"/>
-          <w:sz w:val="19"/>
-        </w:rPr>
-        <w:t xml:space="preserve">IPMA Project Management Fundamentals — </w:t>
-      </w:r>
-      <w:r>
-        <w:rPr>
+          <w:rFonts w:ascii="Calibri" w:hAnsi="Calibri"/>
           <w:color w:val="475569"/>
           <w:sz w:val="19"/>
         </w:rPr>
-        <w:t>Medzinárodná certifikácia projektového manažmentu (2025)</w:t>
-      </w:r>
-    </w:p>
-    <w:p>
-      <w:pPr>
-        <w:pStyle w:val="ListBullet"/>
-        <w:spacing w:before="20" w:after="40"/>
-      </w:pPr>
-      <w:r>
-        <w:rPr>
-          <w:b/>
-          <w:color w:val="0F172A"/>
-          <w:sz w:val="19"/>
-        </w:rPr>
-        <w:t xml:space="preserve">Informačný manažment (Ing.) — </w:t>
-      </w:r>
-      <w:r>
-        <w:rPr>
-          <w:color w:val="475569"/>
-          <w:sz w:val="19"/>
-        </w:rPr>
-        <w:t>Ekonomická univerzita v Bratislave (2024 – 2026)</w:t>
-      </w:r>
-    </w:p>
-    <w:p>
-      <w:pPr>
-        <w:pStyle w:val="ListBullet"/>
-        <w:spacing w:before="20" w:after="40"/>
-      </w:pPr>
-      <w:r>
-        <w:rPr>
-          <w:b/>
-          <w:color w:val="0F172A"/>
-          <w:sz w:val="19"/>
-        </w:rPr>
-        <w:t xml:space="preserve">Hospodárska informatika (Bc.) — </w:t>
-      </w:r>
-      <w:r>
-        <w:rPr>
-          <w:color w:val="475569"/>
-          <w:sz w:val="19"/>
-        </w:rPr>
-        <w:t>Technická univerzita v Košiciach (2022 – 2024)</w:t>
+        <w:t>Bratislava, Slovensko  |  Tel: +421 951 698 832  |  Email: rusbuin.oct@gmail.com</w:t>
+        <w:br/>
+        <w:t>LinkedIn: linkedin.com/in/ruslana-buinytska  |  GitHub: github.com/rbuinytska</w:t>
       </w:r>
     </w:p>
     <w:sectPr>
       <w:pgSz w:w="11909" w:h="16834"/>
-      <w:pgMar w:top="1152" w:right="1224" w:bottom="1152" w:left="1224" w:header="720" w:footer="720" w:gutter="0"/>
+      <w:pgMar w:top="2160" w:right="1728" w:bottom="2160" w:left="1728" w:header="720" w:footer="720" w:gutter="0"/>
       <w:cols w:space="720"/>
       <w:docGrid w:linePitch="360"/>
     </w:sectPr>

</xml_diff>